<commit_message>
Update to do list
</commit_message>
<xml_diff>
--- a/To-do-list.docx
+++ b/To-do-list.docx
@@ -22,15 +22,7 @@
         </w:numPr>
       </w:pPr>
       <w:r>
-        <w:t xml:space="preserve">What shapefiles do we want to use for both </w:t>
-      </w:r>
-      <w:proofErr w:type="spellStart"/>
-      <w:r>
-        <w:t>subsetting</w:t>
-      </w:r>
-      <w:proofErr w:type="spellEnd"/>
-      <w:r>
-        <w:t xml:space="preserve"> in some cases, and plotting?  TL or CB (excludes water areas) or other (Joe had a much higher res shapefile)?</w:t>
+        <w:t>What shapefiles do we want to use for both subsetting in some cases, and plotting?  TL or CB (excludes water areas) or other (Joe had a much higher res shapefile)?</w:t>
       </w:r>
     </w:p>
     <w:p>
@@ -57,75 +49,43 @@
         <w:t>Do we want to keep the option to use XESMF for reprojection, or just always use Terra and don’t provide an alternative “export and do it how you want” option?</w:t>
       </w:r>
       <w:r>
-        <w:t xml:space="preserve">  Right </w:t>
-      </w:r>
-      <w:proofErr w:type="gramStart"/>
-      <w:r>
-        <w:t>now</w:t>
-      </w:r>
-      <w:proofErr w:type="gramEnd"/>
-      <w:r>
-        <w:t xml:space="preserve"> I’ve set XESMF to F at the start of each function as it hasn’t seemed like something we want for a while.</w:t>
-      </w:r>
-    </w:p>
-    <w:p>
-      <w:pPr>
-        <w:pStyle w:val="ListParagraph"/>
-        <w:numPr>
-          <w:ilvl w:val="0"/>
-          <w:numId w:val="1"/>
-        </w:numPr>
-      </w:pPr>
-      <w:r>
-        <w:t xml:space="preserve">Is there a better way to do a config file than </w:t>
-      </w:r>
-      <w:proofErr w:type="gramStart"/>
-      <w:r>
-        <w:t>a .R</w:t>
-      </w:r>
-      <w:proofErr w:type="gramEnd"/>
-      <w:r>
-        <w:t xml:space="preserve"> file like I did?</w:t>
-      </w:r>
-    </w:p>
-    <w:p>
-      <w:pPr>
-        <w:pStyle w:val="ListParagraph"/>
-        <w:numPr>
-          <w:ilvl w:val="0"/>
-          <w:numId w:val="1"/>
-        </w:numPr>
-      </w:pPr>
-      <w:r>
-        <w:t xml:space="preserve">Do we want verbose to dictate saving csv's as well as plots?  What about the input data (e.g., </w:t>
-      </w:r>
-      <w:proofErr w:type="spellStart"/>
-      <w:r>
-        <w:t>tigerlines</w:t>
-      </w:r>
-      <w:proofErr w:type="spellEnd"/>
-      <w:r>
-        <w:t xml:space="preserve"> so they don’t have to be re-downloaded every run)?</w:t>
-      </w:r>
-    </w:p>
-    <w:p>
-      <w:pPr>
-        <w:pStyle w:val="ListParagraph"/>
-        <w:numPr>
-          <w:ilvl w:val="0"/>
-          <w:numId w:val="1"/>
-        </w:numPr>
-      </w:pPr>
-      <w:r>
-        <w:t xml:space="preserve">Do we want to source the function </w:t>
-      </w:r>
-      <w:proofErr w:type="spellStart"/>
-      <w:r>
-        <w:t>Inventory_based_disaggregation</w:t>
-      </w:r>
-      <w:proofErr w:type="spellEnd"/>
-      <w:r>
-        <w:t xml:space="preserve"> in the main or in the 2 sectors it’s used?  It sounded like in the main should be fine last we met.</w:t>
+        <w:t xml:space="preserve">  Right now I’ve set XESMF to F at the start of each function as it hasn’t seemed like something we want for a while.</w:t>
+      </w:r>
+    </w:p>
+    <w:p>
+      <w:pPr>
+        <w:pStyle w:val="ListParagraph"/>
+        <w:numPr>
+          <w:ilvl w:val="0"/>
+          <w:numId w:val="1"/>
+        </w:numPr>
+      </w:pPr>
+      <w:r>
+        <w:t>Is there a better way to do a config file than a .R file like I did?</w:t>
+      </w:r>
+    </w:p>
+    <w:p>
+      <w:pPr>
+        <w:pStyle w:val="ListParagraph"/>
+        <w:numPr>
+          <w:ilvl w:val="0"/>
+          <w:numId w:val="1"/>
+        </w:numPr>
+      </w:pPr>
+      <w:r>
+        <w:t>Do we want verbose to dictate saving csv's as well as plots?  What about the input data (e.g., tigerlines so they don’t have to be re-downloaded every run)?</w:t>
+      </w:r>
+    </w:p>
+    <w:p>
+      <w:pPr>
+        <w:pStyle w:val="ListParagraph"/>
+        <w:numPr>
+          <w:ilvl w:val="0"/>
+          <w:numId w:val="1"/>
+        </w:numPr>
+      </w:pPr>
+      <w:r>
+        <w:t>Do we want to source the function Inventory_based_disaggregation in the main or in the 2 sectors it’s used?  It sounded like in the main should be fine last we met.</w:t>
       </w:r>
     </w:p>
     <w:p>
@@ -152,25 +112,7 @@
         </w:numPr>
       </w:pPr>
       <w:r>
-        <w:t xml:space="preserve">downloading GHGRP data is sometimes repetitive (facility location type data </w:t>
-      </w:r>
-      <w:proofErr w:type="gramStart"/>
-      <w:r>
-        <w:t>in particular is</w:t>
-      </w:r>
-      <w:proofErr w:type="gramEnd"/>
-      <w:r>
-        <w:t xml:space="preserve"> downloaded in full several times).  Talking with EPA about better use of the API may solve this issue but downloading this data 1 x in the main would improve things as well.  I could save it to the input folder like I do with </w:t>
-      </w:r>
-      <w:proofErr w:type="spellStart"/>
-      <w:proofErr w:type="gramStart"/>
-      <w:r>
-        <w:t>tigerlines</w:t>
-      </w:r>
-      <w:proofErr w:type="spellEnd"/>
-      <w:proofErr w:type="gramEnd"/>
-      <w:r>
-        <w:t xml:space="preserve"> so it only has to be downloaded once.  We also discussed being hesitant to use API filters rather than downloading everything and then filtering in R</w:t>
+        <w:t>downloading GHGRP data is sometimes repetitive (facility location type data in particular is downloaded in full several times).  Talking with EPA about better use of the API may solve this issue but downloading this data 1 x in the main would improve things as well.  I could save it to the input folder like I do with tigerlines so it only has to be downloaded once.  We also discussed being hesitant to use API filters rather than downloading everything and then filtering in R</w:t>
       </w:r>
       <w:r>
         <w:t>, but are we fine doing so if we ensure it’s the data it should be?</w:t>
@@ -185,37 +127,13 @@
         </w:numPr>
       </w:pPr>
       <w:r>
-        <w:t xml:space="preserve">E.g., the </w:t>
-      </w:r>
-      <w:proofErr w:type="spellStart"/>
-      <w:r>
-        <w:t>eia</w:t>
-      </w:r>
-      <w:proofErr w:type="spellEnd"/>
-      <w:r>
-        <w:t xml:space="preserve"> API (distribution and stationary combustion) </w:t>
+        <w:t xml:space="preserve">E.g., the eia API (distribution and stationary combustion) </w:t>
       </w:r>
       <w:r>
         <w:t xml:space="preserve">filtering </w:t>
       </w:r>
       <w:r>
-        <w:t xml:space="preserve">changed after I edited stationary combustion.  Filtering by year used to work fine if setting start/end year to the desired year for annual data.  Now that returns nothing and I need a +/- 1 year (stranger still, I needed to start 1 </w:t>
-      </w:r>
-      <w:proofErr w:type="spellStart"/>
-      <w:r>
-        <w:t>yr</w:t>
-      </w:r>
-      <w:proofErr w:type="spellEnd"/>
-      <w:r>
-        <w:t xml:space="preserve"> earlier for 1 </w:t>
-      </w:r>
-      <w:proofErr w:type="gramStart"/>
-      <w:r>
-        <w:t>script, and</w:t>
-      </w:r>
-      <w:proofErr w:type="gramEnd"/>
-      <w:r>
-        <w:t xml:space="preserve"> end 1 year later for the other to get the desired year).</w:t>
+        <w:t>changed after I edited stationary combustion.  Filtering by year used to work fine if setting start/end year to the desired year for annual data.  Now that returns nothing and I need a +/- 1 year (stranger still, I needed to start 1 yr earlier for 1 script, and end 1 year later for the other to get the desired year).</w:t>
       </w:r>
     </w:p>
     <w:p>
@@ -278,15 +196,7 @@
         </w:numPr>
       </w:pPr>
       <w:r>
-        <w:t>GEPA - the new versions no longer include forest fire CH4.  From the 2012 version's paper "</w:t>
-      </w:r>
-      <w:proofErr w:type="gramStart"/>
-      <w:r>
-        <w:t>National forest</w:t>
-      </w:r>
-      <w:proofErr w:type="gramEnd"/>
-      <w:r>
-        <w:t xml:space="preserve"> fire emissions from the GHGI are distributed on a daily basis at 0.1° × 0.1° resolution using the Quick Fire Emissions Data set (QFED v2.4) for 2012".  QFED is available </w:t>
+        <w:t xml:space="preserve">GEPA - the new versions no longer include forest fire CH4.  From the 2012 version's paper "National forest fire emissions from the GHGI are distributed on a daily basis at 0.1° × 0.1° resolution using the Quick Fire Emissions Data set (QFED v2.4) for 2012".  QFED is available </w:t>
       </w:r>
       <w:r>
         <w:lastRenderedPageBreak/>
@@ -314,18 +224,138 @@
         </w:numPr>
       </w:pPr>
       <w:r>
-        <w:t xml:space="preserve">Are you aware of the </w:t>
-      </w:r>
-      <w:proofErr w:type="spellStart"/>
-      <w:r>
-        <w:t>FedData</w:t>
-      </w:r>
-      <w:proofErr w:type="spellEnd"/>
-      <w:r>
-        <w:t xml:space="preserve"> package?  It’s for downloading several federal datasets.  NLCD is all that matters for us now, but several others could be useful.</w:t>
+        <w:t>Are you aware of the FedData package?  It’s for downloading several federal datasets.  NLCD is all that matters for us now, but several others could be useful.</w:t>
       </w:r>
       <w:r>
         <w:t xml:space="preserve">  I can either use that package to automate NLCD download, or just find the necessary bare bones (link setup) from their function.  </w:t>
+      </w:r>
+    </w:p>
+    <w:p>
+      <w:pPr>
+        <w:pStyle w:val="ListParagraph"/>
+        <w:numPr>
+          <w:ilvl w:val="0"/>
+          <w:numId w:val="1"/>
+        </w:numPr>
+      </w:pPr>
+      <w:r>
+        <w:t>Is there a better way to set the focus city?  I considered grep, but too many urban areas/clusters have similar names.  There’s Philadelphia PA, and one in MS and New Philadelphia OH.  I considered name, state, but there’s cases like Baltimore, OH (central) and North Baltimore OH (SW).</w:t>
+      </w:r>
+    </w:p>
+    <w:p>
+      <w:pPr>
+        <w:pStyle w:val="ListParagraph"/>
+        <w:numPr>
+          <w:ilvl w:val="0"/>
+          <w:numId w:val="1"/>
+        </w:numPr>
+      </w:pPr>
+      <w:r>
+        <w:t xml:space="preserve">I used @reference for WWTP for example, but it wasn’t anywhere in the documentation output so I added it to the details too.  Did I misunderstand?  </w:t>
+      </w:r>
+      <w:r>
+        <w:fldChar w:fldCharType="begin"/>
+      </w:r>
+      <w:ins w:id="0" w:author="Kristian Hajny" w:date="2024-06-19T16:41:00Z" w16du:dateUtc="2024-06-19T20:41:00Z">
+        <w:r>
+          <w:instrText>HYPERLINK "</w:instrText>
+        </w:r>
+      </w:ins>
+      <w:r>
+        <w:instrText>https://roxygen2.r-lib.org/articles/index-crossref.html?q=@reference#references</w:instrText>
+      </w:r>
+      <w:ins w:id="1" w:author="Kristian Hajny" w:date="2024-06-19T16:41:00Z" w16du:dateUtc="2024-06-19T20:41:00Z">
+        <w:r>
+          <w:instrText>"</w:instrText>
+        </w:r>
+      </w:ins>
+      <w:r>
+        <w:fldChar w:fldCharType="separate"/>
+      </w:r>
+      <w:r>
+        <w:rPr>
+          <w:rStyle w:val="Hyperlink"/>
+        </w:rPr>
+        <w:t>https://roxygen2.r-lib.org/articles/index-crossref.html?q=@reference#references</w:t>
+      </w:r>
+      <w:r>
+        <w:fldChar w:fldCharType="end"/>
+      </w:r>
+      <w:r>
+        <w:t>.  Document package claimed it was an unrecognized tag…  We’ll see when I actually run roxygen.</w:t>
+      </w:r>
+    </w:p>
+    <w:p>
+      <w:pPr>
+        <w:pStyle w:val="ListParagraph"/>
+        <w:numPr>
+          <w:ilvl w:val="0"/>
+          <w:numId w:val="1"/>
+        </w:numPr>
+      </w:pPr>
+      <w:r>
+        <w:t xml:space="preserve">Stationary combustion – I didn’t see any clear description of the energy atlas data or HIFLD compressor data (e.g., update frequency).  Should I say something more about the data than I did?  </w:t>
+      </w:r>
+      <w:hyperlink r:id="rId5" w:history="1">
+        <w:r>
+          <w:rPr>
+            <w:rStyle w:val="Hyperlink"/>
+          </w:rPr>
+          <w:t>https://hifld-geoplatform.hub.arcgis.com/datasets/geoplatform::natural-gas-compressor-stations/about</w:t>
+        </w:r>
+      </w:hyperlink>
+      <w:r>
+        <w:br/>
+      </w:r>
+      <w:hyperlink r:id="rId6" w:history="1">
+        <w:r>
+          <w:rPr>
+            <w:rStyle w:val="Hyperlink"/>
+          </w:rPr>
+          <w:t>https://atlas.eia.gov/datasets/eia::natural-gas-interstate-and-intrastate-pipelines/about</w:t>
+        </w:r>
+      </w:hyperlink>
+      <w:r>
+        <w:t xml:space="preserve"> </w:t>
+      </w:r>
+    </w:p>
+    <w:p>
+      <w:pPr>
+        <w:pStyle w:val="ListParagraph"/>
+        <w:numPr>
+          <w:ilvl w:val="0"/>
+          <w:numId w:val="1"/>
+        </w:numPr>
+      </w:pPr>
+      <w:r>
+        <w:t xml:space="preserve">I noticed I stopped using filter Vulcan commercial at some point.  Just for the NG distribution – he filtered commercial Vulcan to set any pixel greater than the maximum in residential to that maximum in residential.  </w:t>
+      </w:r>
+      <w:r>
+        <w:t>Was this something we discussed or just a mistake on my part?</w:t>
+      </w:r>
+    </w:p>
+    <w:p>
+      <w:pPr>
+        <w:pStyle w:val="ListParagraph"/>
+        <w:numPr>
+          <w:ilvl w:val="1"/>
+          <w:numId w:val="1"/>
+        </w:numPr>
+      </w:pPr>
+      <w:r>
+        <w:t>He said there was at least 1 industrial facility that was miscategorized as commercial.  It had huge emissions, wasn’t NG, so I filtered it out.  ACES looked OK, so I didn’t do this to ACES…  For stationary combustion I want to include sources from all sectors and fuel types.  In cases where Vulcan miscategorized, I’d rather include them in the wrong category than exclude them, in contrast to NG distribution where I don’t want to include large industrial sources that don’t even use NG.</w:t>
+      </w:r>
+    </w:p>
+    <w:p>
+      <w:pPr>
+        <w:pStyle w:val="ListParagraph"/>
+        <w:numPr>
+          <w:ilvl w:val="0"/>
+          <w:numId w:val="1"/>
+        </w:numPr>
+      </w:pPr>
+      <w:r>
+        <w:t>Future topics once code looks good – Uncertainties.  Seasonality.  Improved sectors.  New sectors.</w:t>
       </w:r>
     </w:p>
     <w:p>
@@ -372,31 +402,77 @@
         </w:numPr>
       </w:pPr>
       <w:r>
-        <w:t xml:space="preserve">Need to post simplistic case for terra extract to </w:t>
-      </w:r>
-      <w:proofErr w:type="spellStart"/>
-      <w:r>
-        <w:t>github</w:t>
-      </w:r>
-      <w:proofErr w:type="spellEnd"/>
-      <w:r>
-        <w:t xml:space="preserve"> still.  </w:t>
-      </w:r>
-      <w:proofErr w:type="spellStart"/>
-      <w:r>
-        <w:t>exactextractR</w:t>
-      </w:r>
-      <w:proofErr w:type="spellEnd"/>
-      <w:r>
-        <w:t xml:space="preserve"> (adds exact=T for </w:t>
-      </w:r>
-      <w:proofErr w:type="gramStart"/>
-      <w:r>
-        <w:t>raster::</w:t>
-      </w:r>
-      <w:proofErr w:type="gramEnd"/>
-      <w:r>
-        <w:t>extract) agrees almost perfectly, but for the simple case it gave the expected answer (1/2) whereas terra was always a little off.</w:t>
+        <w:t>Add a clear **Optional** to the documentation where relevant</w:t>
+      </w:r>
+    </w:p>
+    <w:p>
+      <w:pPr>
+        <w:pStyle w:val="ListParagraph"/>
+        <w:numPr>
+          <w:ilvl w:val="0"/>
+          <w:numId w:val="1"/>
+        </w:numPr>
+      </w:pPr>
+      <w:r>
+        <w:t xml:space="preserve">Distribution </w:t>
+      </w:r>
+      <w:r>
+        <w:t>–</w:t>
+      </w:r>
+      <w:r>
+        <w:t xml:space="preserve"> </w:t>
+      </w:r>
+      <w:r>
+        <w:t>Need to figure out what the heck above vs below grade station means to better explain in documentation</w:t>
+      </w:r>
+    </w:p>
+    <w:p>
+      <w:pPr>
+        <w:pStyle w:val="ListParagraph"/>
+        <w:numPr>
+          <w:ilvl w:val="0"/>
+          <w:numId w:val="1"/>
+        </w:numPr>
+      </w:pPr>
+      <w:r>
+        <w:lastRenderedPageBreak/>
+        <w:t>Transmission – why do we calculate emission factors from emissions and activity rather than use the emission factors themselves from the GHGI annex?</w:t>
+      </w:r>
+    </w:p>
+    <w:p>
+      <w:pPr>
+        <w:pStyle w:val="ListParagraph"/>
+        <w:numPr>
+          <w:ilvl w:val="0"/>
+          <w:numId w:val="1"/>
+        </w:numPr>
+      </w:pPr>
+      <w:r>
+        <w:t>Need to post simplistic case for terra extract to github still.  exactextractR (adds exact=T for raster::extract) agrees almost perfectly, but for the simple case it gave the expected answer (1/2) whereas terra was always a little off.</w:t>
+      </w:r>
+    </w:p>
+    <w:p>
+      <w:pPr>
+        <w:pStyle w:val="ListParagraph"/>
+        <w:numPr>
+          <w:ilvl w:val="0"/>
+          <w:numId w:val="1"/>
+        </w:numPr>
+      </w:pPr>
+      <w:r>
+        <w:t>Distribution (maybe stationary) – would cropping ACES/Vulcan help speed up?  Could reproject state_tigerlines and crop similar to some other functions to crop + buffer.</w:t>
+      </w:r>
+    </w:p>
+    <w:p>
+      <w:pPr>
+        <w:pStyle w:val="ListParagraph"/>
+        <w:numPr>
+          <w:ilvl w:val="0"/>
+          <w:numId w:val="1"/>
+        </w:numPr>
+      </w:pPr>
+      <w:r>
+        <w:t>Very carefully check project – make sure resolution (or similar) isn’t changed unless it has to be</w:t>
       </w:r>
     </w:p>
     <w:p>
@@ -420,6 +496,18 @@
         </w:numPr>
       </w:pPr>
       <w:r>
+        <w:t>Transmission – look into using the GHGI annex index to automatically figure out the needed sheets.</w:t>
+      </w:r>
+    </w:p>
+    <w:p>
+      <w:pPr>
+        <w:pStyle w:val="ListParagraph"/>
+        <w:numPr>
+          <w:ilvl w:val="0"/>
+          <w:numId w:val="1"/>
+        </w:numPr>
+      </w:pPr>
+      <w:r>
         <w:t>Need to be careful with any sort of API-based filtering of GHGRP data.  Saw that compressors subset to the states of interest included a few on the W coast...  Possible that some weren't included in the same (erroneous) fashion.</w:t>
       </w:r>
     </w:p>
@@ -432,91 +520,43 @@
         </w:numPr>
       </w:pPr>
       <w:r>
-        <w:t xml:space="preserve">double check </w:t>
-      </w:r>
-      <w:proofErr w:type="spellStart"/>
-      <w:r>
-        <w:t>ghgrp</w:t>
-      </w:r>
-      <w:proofErr w:type="spellEnd"/>
-      <w:r>
-        <w:t xml:space="preserve"> downloads - transmission (part W) includes a lot of facilities that report to subpart W, but are not what we're interested in. Additionally, some have different names between subparts - so merging may need to be done differently...</w:t>
-      </w:r>
-    </w:p>
-    <w:p>
-      <w:pPr>
-        <w:pStyle w:val="ListParagraph"/>
-        <w:numPr>
-          <w:ilvl w:val="0"/>
-          <w:numId w:val="1"/>
-        </w:numPr>
-      </w:pPr>
-      <w:r>
-        <w:t xml:space="preserve">stress test main - change domain to a completely different region (and res), change to use an input raster rather than a </w:t>
-      </w:r>
-      <w:proofErr w:type="spellStart"/>
-      <w:r>
-        <w:t>bbox</w:t>
-      </w:r>
-      <w:proofErr w:type="spellEnd"/>
-      <w:r>
-        <w:t xml:space="preserve">, change </w:t>
-      </w:r>
-      <w:proofErr w:type="spellStart"/>
-      <w:r>
-        <w:t>crs</w:t>
-      </w:r>
-      <w:proofErr w:type="spellEnd"/>
-      <w:r>
-        <w:t xml:space="preserve"> to one none of the input uses (e.g., UTM EPSG:3372), change year</w:t>
-      </w:r>
-    </w:p>
-    <w:p>
-      <w:pPr>
-        <w:pStyle w:val="ListParagraph"/>
-        <w:numPr>
-          <w:ilvl w:val="0"/>
-          <w:numId w:val="1"/>
-        </w:numPr>
-      </w:pPr>
-      <w:r>
-        <w:t xml:space="preserve">As the package files (config, other functions, etc.) are going to be part of the same </w:t>
-      </w:r>
-      <w:proofErr w:type="spellStart"/>
-      <w:r>
-        <w:t>fileset</w:t>
-      </w:r>
-      <w:proofErr w:type="spellEnd"/>
-      <w:r>
-        <w:t xml:space="preserve">, sourcing them should be fine, but the </w:t>
-      </w:r>
-      <w:proofErr w:type="spellStart"/>
-      <w:r>
-        <w:t>filepaths</w:t>
-      </w:r>
-      <w:proofErr w:type="spellEnd"/>
-      <w:r>
-        <w:t xml:space="preserve"> will need to be changed.  Is there a good way to set this up?</w:t>
-      </w:r>
-    </w:p>
-    <w:p>
-      <w:pPr>
-        <w:pStyle w:val="ListParagraph"/>
-        <w:numPr>
-          <w:ilvl w:val="0"/>
-          <w:numId w:val="1"/>
-        </w:numPr>
-      </w:pPr>
-      <w:r>
-        <w:t xml:space="preserve">So </w:t>
-      </w:r>
-      <w:proofErr w:type="gramStart"/>
-      <w:r>
-        <w:t>far</w:t>
-      </w:r>
-      <w:proofErr w:type="gramEnd"/>
-      <w:r>
-        <w:t xml:space="preserve"> the ECHO API doesn't seem to provide similar NEI data, but only facility locations without the emissions data.  Same for wastewater data https://echo.epa.gov/tools/web-services/facility-search-water/Facility%20Information/get_cwa_rest_services_get_download</w:t>
+        <w:t>double check ghgrp downloads - transmission (part W) includes a lot of facilities that report to subpart W, but are not what we're interested in. Additionally, some have different names between subparts - so merging may need to be done differently...</w:t>
+      </w:r>
+    </w:p>
+    <w:p>
+      <w:pPr>
+        <w:pStyle w:val="ListParagraph"/>
+        <w:numPr>
+          <w:ilvl w:val="0"/>
+          <w:numId w:val="1"/>
+        </w:numPr>
+      </w:pPr>
+      <w:r>
+        <w:t>stress test main - change domain to a completely different region (and res), change to use an input raster rather than a bbox, change crs to one none of the input uses (e.g., UTM EPSG:3372), change year</w:t>
+      </w:r>
+    </w:p>
+    <w:p>
+      <w:pPr>
+        <w:pStyle w:val="ListParagraph"/>
+        <w:numPr>
+          <w:ilvl w:val="0"/>
+          <w:numId w:val="1"/>
+        </w:numPr>
+      </w:pPr>
+      <w:r>
+        <w:t>As the package files (config, other functions, etc.) are going to be part of the same fileset, sourcing them should be fine, but the filepaths will need to be changed.  Is there a good way to set this up?</w:t>
+      </w:r>
+    </w:p>
+    <w:p>
+      <w:pPr>
+        <w:pStyle w:val="ListParagraph"/>
+        <w:numPr>
+          <w:ilvl w:val="0"/>
+          <w:numId w:val="1"/>
+        </w:numPr>
+      </w:pPr>
+      <w:r>
+        <w:t>So far the ECHO API doesn't seem to provide similar NEI data, but only facility locations without the emissions data.  Same for wastewater data https://echo.epa.gov/tools/web-services/facility-search-water/Facility%20Information/get_cwa_rest_services_get_download</w:t>
       </w:r>
     </w:p>
     <w:p>
@@ -530,7 +570,7 @@
       <w:r>
         <w:t xml:space="preserve">Difficulty using USGS API too.  </w:t>
       </w:r>
-      <w:hyperlink r:id="rId5" w:history="1">
+      <w:hyperlink r:id="rId7" w:history="1">
         <w:r>
           <w:rPr>
             <w:rStyle w:val="Hyperlink"/>
@@ -551,15 +591,7 @@
         </w:numPr>
       </w:pPr>
       <w:r>
-        <w:t xml:space="preserve">Do we need the urban </w:t>
-      </w:r>
-      <w:proofErr w:type="spellStart"/>
-      <w:r>
-        <w:t>tigerlines</w:t>
-      </w:r>
-      <w:proofErr w:type="spellEnd"/>
-      <w:r>
-        <w:t xml:space="preserve">, or just the focus city ones?  </w:t>
+        <w:t xml:space="preserve">Do we need the urban tigerlines, or just the focus city ones?  </w:t>
       </w:r>
     </w:p>
     <w:p>
@@ -595,52 +627,23 @@
         </w:numPr>
       </w:pPr>
       <w:r>
+        <w:t>Should change it so that different variants are all possible in any combination.  E.g., like Vulcan or ACES (either or both can be true).  This applies to wastewater (Moore vs GHGI, scaled emissions for septic vs reported septic emissions - which can be varied by state).</w:t>
+      </w:r>
+    </w:p>
+    <w:p>
+      <w:pPr>
+        <w:pStyle w:val="ListParagraph"/>
+        <w:numPr>
+          <w:ilvl w:val="0"/>
+          <w:numId w:val="1"/>
+        </w:numPr>
+      </w:pPr>
+      <w:r>
+        <w:t xml:space="preserve">Noticed an issue with WWTP that has an impact on a few pixels.  Pixels that are on the border of 2 states get included in both.  This occurs when masking.  Can easily deal with it by calculating fractional coverage within the state and multiplying by this weighting to put </w:t>
+      </w:r>
+      <w:r>
         <w:lastRenderedPageBreak/>
-        <w:t>Should change it so that different variants are all possible in any combination.  E.g.</w:t>
-      </w:r>
-      <w:proofErr w:type="gramStart"/>
-      <w:r>
-        <w:t>, like</w:t>
-      </w:r>
-      <w:proofErr w:type="gramEnd"/>
-      <w:r>
-        <w:t xml:space="preserve"> Vulcan or ACES (either or both can be true).  This applies to wastewater (Moore vs GHGI, scaled emissions for septic vs reported septic emissions - which can be varied by state).</w:t>
-      </w:r>
-    </w:p>
-    <w:p>
-      <w:pPr>
-        <w:pStyle w:val="ListParagraph"/>
-        <w:numPr>
-          <w:ilvl w:val="0"/>
-          <w:numId w:val="1"/>
-        </w:numPr>
-      </w:pPr>
-      <w:r>
-        <w:t xml:space="preserve">Noticed an issue with WWTP that has an impact on a few pixels.  Pixels that are on the border of 2 states get included in both.  This occurs when masking.  Can easily deal with it by calculating fractional coverage within the state and multiplying by this weighting to put these pixels partially within each state and then adding them in the final domain-scale output.  </w:t>
-      </w:r>
-      <w:proofErr w:type="gramStart"/>
-      <w:r>
-        <w:t>Of course</w:t>
-      </w:r>
-      <w:proofErr w:type="gramEnd"/>
-      <w:r>
-        <w:t xml:space="preserve"> this ignores the fact that pre-aggregation more of the </w:t>
-      </w:r>
-      <w:proofErr w:type="spellStart"/>
-      <w:r>
-        <w:t>landtype</w:t>
-      </w:r>
-      <w:proofErr w:type="spellEnd"/>
-      <w:r>
-        <w:t xml:space="preserve"> of interest could be in 1 state than the other, not necessarily evenly distributed...  Simple comparison to how </w:t>
-      </w:r>
-      <w:proofErr w:type="gramStart"/>
-      <w:r>
-        <w:t>raster::</w:t>
-      </w:r>
-      <w:proofErr w:type="gramEnd"/>
-      <w:r>
-        <w:t>mask did it needed.</w:t>
+        <w:t>these pixels partially within each state and then adding them in the final domain-scale output.  Of course this ignores the fact that pre-aggregation more of the landtype of interest could be in 1 state than the other, not necessarily evenly distributed...  Simple comparison to how raster::mask did it needed.</w:t>
       </w:r>
     </w:p>
     <w:p>
@@ -670,15 +673,7 @@
         </w:numPr>
       </w:pPr>
       <w:r>
-        <w:t xml:space="preserve">After </w:t>
-      </w:r>
-      <w:proofErr w:type="gramStart"/>
-      <w:r>
-        <w:t>confident</w:t>
-      </w:r>
-      <w:proofErr w:type="gramEnd"/>
-      <w:r>
-        <w:t xml:space="preserve"> that everything works as intended and gives equivalent output as the older version of the code, update input datasets as relevant.  E.g., newer NEI, newer CWNS, newer GHGI file, newer LMOP, etc.</w:t>
+        <w:t>After confident that everything works as intended and gives equivalent output as the older version of the code, update input datasets as relevant.  E.g., newer NEI, newer CWNS, newer GHGI file, newer LMOP, etc.</w:t>
       </w:r>
     </w:p>
     <w:p>
@@ -729,39 +724,13 @@
         </w:numPr>
       </w:pPr>
       <w:r>
-        <w:t xml:space="preserve">for </w:t>
-      </w:r>
-      <w:proofErr w:type="spellStart"/>
-      <w:r>
-        <w:t>NLCD_fraction</w:t>
-      </w:r>
-      <w:proofErr w:type="spellEnd"/>
-      <w:r>
-        <w:t xml:space="preserve"> saw that the domain-sum of open</w:t>
+        <w:t>for NLCD_fraction saw that the domain-sum of open</w:t>
       </w:r>
       <w:r>
         <w:t xml:space="preserve"> </w:t>
       </w:r>
       <w:r>
-        <w:t>(global(open*</w:t>
-      </w:r>
-      <w:proofErr w:type="spellStart"/>
-      <w:r>
-        <w:t>cellSize</w:t>
-      </w:r>
-      <w:proofErr w:type="spellEnd"/>
-      <w:r>
-        <w:t>(</w:t>
-      </w:r>
-      <w:proofErr w:type="spellStart"/>
-      <w:proofErr w:type="gramStart"/>
-      <w:r>
-        <w:t>open,unit</w:t>
-      </w:r>
-      <w:proofErr w:type="spellEnd"/>
-      <w:proofErr w:type="gramEnd"/>
-      <w:r>
-        <w:t>="km"),sum,na.rm=T) was 5235.635 when projecting</w:t>
+        <w:t>(global(open*cellSize(open,unit="km"),sum,na.rm=T) was 5235.635 when projecting</w:t>
       </w:r>
       <w:r>
         <w:t xml:space="preserve"> </w:t>
@@ -802,35 +771,17 @@
       <w:r>
         <w:t xml:space="preserve"> </w:t>
       </w:r>
-      <w:proofErr w:type="spellStart"/>
-      <w:r>
-        <w:t>cubicspline</w:t>
-      </w:r>
-      <w:proofErr w:type="spellEnd"/>
-      <w:r>
-        <w:t xml:space="preserve"> = 5177.335</w:t>
+      <w:r>
+        <w:t>cubicspline = 5177.335</w:t>
       </w:r>
       <w:r>
         <w:t xml:space="preserve"> </w:t>
       </w:r>
-      <w:proofErr w:type="spellStart"/>
-      <w:r>
-        <w:t>lanczos</w:t>
-      </w:r>
-      <w:proofErr w:type="spellEnd"/>
-      <w:r>
-        <w:t xml:space="preserve"> = </w:t>
-      </w:r>
-      <w:proofErr w:type="gramStart"/>
-      <w:r>
-        <w:t>5195.922</w:t>
-      </w:r>
-      <w:r>
-        <w:t xml:space="preserve"> .</w:t>
-      </w:r>
-      <w:proofErr w:type="gramEnd"/>
-      <w:r>
-        <w:t xml:space="preserve">  </w:t>
+      <w:r>
+        <w:t>lanczos = 5195.922</w:t>
+      </w:r>
+      <w:r>
+        <w:t xml:space="preserve"> .  </w:t>
       </w:r>
       <w:r>
         <w:t xml:space="preserve">We </w:t>
@@ -839,15 +790,7 @@
         <w:t>previously</w:t>
       </w:r>
       <w:r>
-        <w:t xml:space="preserve"> used </w:t>
-      </w:r>
-      <w:proofErr w:type="gramStart"/>
-      <w:r>
-        <w:t>nearest</w:t>
-      </w:r>
-      <w:proofErr w:type="gramEnd"/>
-      <w:r>
-        <w:t xml:space="preserve"> neighbor and that's what I currently use too.</w:t>
+        <w:t xml:space="preserve"> used nearest neighbor and that's what I currently use too.</w:t>
       </w:r>
     </w:p>
     <w:p>
@@ -871,21 +814,13 @@
         </w:numPr>
       </w:pPr>
       <w:r>
-        <w:t xml:space="preserve"> Industrial wastewater facilities sometimes report CH4 to subparts </w:t>
-      </w:r>
-      <w:proofErr w:type="gramStart"/>
-      <w:r>
-        <w:t>AA</w:t>
+        <w:t xml:space="preserve"> Industrial wastewater facilities sometimes report CH4 to subparts AA</w:t>
       </w:r>
       <w:r>
         <w:t xml:space="preserve"> </w:t>
       </w:r>
       <w:r>
-        <w:t xml:space="preserve"> (</w:t>
-      </w:r>
-      <w:proofErr w:type="gramEnd"/>
-      <w:r>
-        <w:t>pulp/paper), C (combustion), and TT (industrial landfill), but the GHGRP</w:t>
+        <w:t xml:space="preserve"> (pulp/paper), C (combustion), and TT (industrial landfill), but the GHGRP</w:t>
       </w:r>
       <w:r>
         <w:t xml:space="preserve"> </w:t>
@@ -929,152 +864,118 @@
           <w:numId w:val="1"/>
         </w:numPr>
       </w:pPr>
-      <w:proofErr w:type="gramStart"/>
-      <w:r>
-        <w:t>by</w:t>
-      </w:r>
-      <w:proofErr w:type="gramEnd"/>
+      <w:r>
+        <w:t>by default terra has progress bars for steps that take a long time (e.g., NLCD</w:t>
+      </w:r>
       <w:r>
         <w:t xml:space="preserve"> </w:t>
       </w:r>
-      <w:proofErr w:type="gramStart"/>
-      <w:r>
-        <w:t>default</w:t>
-      </w:r>
-      <w:proofErr w:type="gramEnd"/>
-      <w:r>
-        <w:t xml:space="preserve"> terra has progress bars for steps that take a long time (e.g., NLCD</w:t>
+      <w:r>
+        <w:t>calculations).  Do we want this behavior?  If so we should add clarification</w:t>
       </w:r>
       <w:r>
         <w:t xml:space="preserve"> </w:t>
       </w:r>
       <w:r>
-        <w:t xml:space="preserve">calculations).  Do we want this behavior?  If </w:t>
-      </w:r>
-      <w:proofErr w:type="gramStart"/>
-      <w:r>
-        <w:t>so</w:t>
-      </w:r>
-      <w:proofErr w:type="gramEnd"/>
-      <w:r>
-        <w:t xml:space="preserve"> we should add clarification</w:t>
+        <w:t>before each discussing WHAT is in progress (confusing otherwise).</w:t>
+      </w:r>
+    </w:p>
+    <w:p>
+      <w:pPr>
+        <w:pStyle w:val="ListParagraph"/>
+        <w:numPr>
+          <w:ilvl w:val="0"/>
+          <w:numId w:val="1"/>
+        </w:numPr>
+      </w:pPr>
+      <w:r>
+        <w:t>need to go through and properly set verbose if statements for some codes.</w:t>
+      </w:r>
+    </w:p>
+    <w:p>
+      <w:pPr>
+        <w:pStyle w:val="ListParagraph"/>
+        <w:numPr>
+          <w:ilvl w:val="0"/>
+          <w:numId w:val="1"/>
+        </w:numPr>
+      </w:pPr>
+      <w:r>
+        <w:t>Need to check for reused data (e.g., ACES/Vulcan, GHGRP facility data, GHGRP</w:t>
       </w:r>
       <w:r>
         <w:t xml:space="preserve"> </w:t>
       </w:r>
       <w:r>
-        <w:t>before each discussing WHAT is in progress (confusing otherwise).</w:t>
-      </w:r>
-    </w:p>
-    <w:p>
-      <w:pPr>
-        <w:pStyle w:val="ListParagraph"/>
-        <w:numPr>
-          <w:ilvl w:val="0"/>
-          <w:numId w:val="1"/>
-        </w:numPr>
-      </w:pPr>
-      <w:r>
-        <w:t>need to go through and properly set verbose if statements for some codes.</w:t>
-      </w:r>
-    </w:p>
-    <w:p>
-      <w:pPr>
-        <w:pStyle w:val="ListParagraph"/>
-        <w:numPr>
-          <w:ilvl w:val="0"/>
-          <w:numId w:val="1"/>
-        </w:numPr>
-      </w:pPr>
-      <w:r>
-        <w:t>Need to check for reused data (e.g., ACES/Vulcan, GHGRP facility data, GHGRP</w:t>
+        <w:t xml:space="preserve">combustion data) and consider downloading </w:t>
+      </w:r>
+      <w:r>
+        <w:t xml:space="preserve">in Main </w:t>
+      </w:r>
+      <w:r>
+        <w:t>rather than in multiple scripts.</w:t>
+      </w:r>
+    </w:p>
+    <w:p>
+      <w:pPr>
+        <w:pStyle w:val="ListParagraph"/>
+        <w:numPr>
+          <w:ilvl w:val="0"/>
+          <w:numId w:val="1"/>
+        </w:numPr>
+      </w:pPr>
+      <w:r>
+        <w:t>Need to consider saving input data like GHGRP to be loaded instead of</w:t>
       </w:r>
       <w:r>
         <w:t xml:space="preserve"> </w:t>
       </w:r>
       <w:r>
-        <w:t xml:space="preserve">combustion data) and consider downloading </w:t>
-      </w:r>
-      <w:r>
-        <w:t xml:space="preserve">in Main </w:t>
-      </w:r>
-      <w:r>
-        <w:t>rather than in multiple scripts.</w:t>
-      </w:r>
-    </w:p>
-    <w:p>
-      <w:pPr>
-        <w:pStyle w:val="ListParagraph"/>
-        <w:numPr>
-          <w:ilvl w:val="0"/>
-          <w:numId w:val="1"/>
-        </w:numPr>
-      </w:pPr>
-      <w:r>
-        <w:t>Need to consider saving input data like GHGRP to be loaded instead of</w:t>
+        <w:t>re-downloaded each time (like tigerlines) to speed up multiple runs.</w:t>
+      </w:r>
+    </w:p>
+    <w:p>
+      <w:pPr>
+        <w:pStyle w:val="ListParagraph"/>
+        <w:numPr>
+          <w:ilvl w:val="0"/>
+          <w:numId w:val="1"/>
+        </w:numPr>
+      </w:pPr>
+      <w:r>
+        <w:t>we can speed up downloading API resources by filtering to just the data we need</w:t>
       </w:r>
       <w:r>
         <w:t xml:space="preserve"> </w:t>
       </w:r>
       <w:r>
-        <w:t xml:space="preserve">re-downloaded each time (like </w:t>
-      </w:r>
-      <w:proofErr w:type="spellStart"/>
-      <w:r>
-        <w:t>tigerlines</w:t>
-      </w:r>
-      <w:proofErr w:type="spellEnd"/>
-      <w:r>
-        <w:t>) to speed up multiple runs.</w:t>
-      </w:r>
-    </w:p>
-    <w:p>
-      <w:pPr>
-        <w:pStyle w:val="ListParagraph"/>
-        <w:numPr>
-          <w:ilvl w:val="0"/>
-          <w:numId w:val="1"/>
-        </w:numPr>
-      </w:pPr>
-      <w:r>
-        <w:t>we can speed up downloading API resources by filtering to just the data we need</w:t>
+        <w:t>as long as we ensure it's not different data (like GHGRP was).</w:t>
+      </w:r>
+    </w:p>
+    <w:p>
+      <w:pPr>
+        <w:pStyle w:val="ListParagraph"/>
+        <w:numPr>
+          <w:ilvl w:val="0"/>
+          <w:numId w:val="1"/>
+        </w:numPr>
+      </w:pPr>
+      <w:r>
+        <w:t xml:space="preserve">Stationary combustion – </w:t>
+      </w:r>
+      <w:r>
+        <w:t>Need to consider the potential of multiples (3 GHGRP facilities match to the</w:t>
       </w:r>
       <w:r>
         <w:t xml:space="preserve"> </w:t>
       </w:r>
-      <w:proofErr w:type="gramStart"/>
-      <w:r>
-        <w:t>as long as</w:t>
-      </w:r>
-      <w:proofErr w:type="gramEnd"/>
-      <w:r>
-        <w:t xml:space="preserve"> we ensure it's not different data (like GHGRP was).</w:t>
-      </w:r>
-    </w:p>
-    <w:p>
-      <w:pPr>
-        <w:pStyle w:val="ListParagraph"/>
-        <w:numPr>
-          <w:ilvl w:val="0"/>
-          <w:numId w:val="1"/>
-        </w:numPr>
-      </w:pPr>
-      <w:r>
-        <w:t xml:space="preserve">Stationary combustion – </w:t>
-      </w:r>
-      <w:r>
-        <w:t>Need to consider the potential of multiples (3 GHGRP facilities match to the</w:t>
+      <w:r>
+        <w:t>same HIFLD one).  I believe the code would just use 1 of them and ignore the</w:t>
       </w:r>
       <w:r>
         <w:t xml:space="preserve"> </w:t>
       </w:r>
       <w:r>
-        <w:t>same HIFLD one).  I believe the code would just use 1 of them and ignore the</w:t>
-      </w:r>
-      <w:r>
-        <w:t xml:space="preserve"> </w:t>
-      </w:r>
-      <w:r>
         <w:t>others.</w:t>
       </w:r>
     </w:p>
@@ -1087,201 +988,68 @@
         </w:numPr>
       </w:pPr>
       <w:r>
+        <w:t>add clear user update(s) for each Sector (e.g., cat("starting sector X\n") ... cat("processing Y for sector X\n"))</w:t>
+      </w:r>
+    </w:p>
+    <w:p>
+      <w:pPr>
+        <w:pStyle w:val="ListParagraph"/>
+        <w:numPr>
+          <w:ilvl w:val="0"/>
+          <w:numId w:val="1"/>
+        </w:numPr>
+      </w:pPr>
+      <w:r>
+        <w:t>for NG distribution - the EIA does have state level data available by API, but I could not find an api to access the forms that are per company</w:t>
+      </w:r>
+    </w:p>
+    <w:p>
+      <w:pPr>
+        <w:pStyle w:val="ListParagraph"/>
+        <w:numPr>
+          <w:ilvl w:val="0"/>
+          <w:numId w:val="1"/>
+        </w:numPr>
+      </w:pPr>
+      <w:r>
         <w:lastRenderedPageBreak/>
-        <w:t xml:space="preserve">add clear user update(s) for each Sector (e.g., </w:t>
-      </w:r>
-      <w:proofErr w:type="gramStart"/>
-      <w:r>
-        <w:t>cat(</w:t>
-      </w:r>
-      <w:proofErr w:type="gramEnd"/>
-      <w:r>
-        <w:t>"starting sector X\n") ... cat("processing Y for sector X\n"))</w:t>
-      </w:r>
-    </w:p>
-    <w:p>
-      <w:pPr>
-        <w:pStyle w:val="ListParagraph"/>
-        <w:numPr>
-          <w:ilvl w:val="0"/>
-          <w:numId w:val="1"/>
-        </w:numPr>
-      </w:pPr>
-      <w:r>
-        <w:t xml:space="preserve">for NG distribution - the EIA does have state level data available by API, but I could not find an </w:t>
-      </w:r>
-      <w:proofErr w:type="spellStart"/>
-      <w:r>
-        <w:t>api</w:t>
-      </w:r>
-      <w:proofErr w:type="spellEnd"/>
-      <w:r>
-        <w:t xml:space="preserve"> to access the forms that are per company</w:t>
-      </w:r>
-    </w:p>
-    <w:p>
-      <w:pPr>
-        <w:pStyle w:val="ListParagraph"/>
-        <w:numPr>
-          <w:ilvl w:val="0"/>
-          <w:numId w:val="1"/>
-        </w:numPr>
-      </w:pPr>
-      <w:r>
-        <w:t xml:space="preserve">for NG distribution - we discussed having a separate script to build the by-LDC shapefiles and just including those in the </w:t>
-      </w:r>
-      <w:proofErr w:type="gramStart"/>
-      <w:r>
-        <w:t>package?.</w:t>
-      </w:r>
-      <w:proofErr w:type="gramEnd"/>
-      <w:r>
-        <w:t xml:space="preserve">  Right </w:t>
-      </w:r>
-      <w:proofErr w:type="gramStart"/>
-      <w:r>
-        <w:t>now</w:t>
-      </w:r>
-      <w:proofErr w:type="gramEnd"/>
-      <w:r>
-        <w:t xml:space="preserve"> it's just loading in the prepared files from what I did for Philly before.  I will need to spend some time </w:t>
-      </w:r>
-      <w:proofErr w:type="gramStart"/>
-      <w:r>
-        <w:t>recoding</w:t>
-      </w:r>
-      <w:proofErr w:type="gramEnd"/>
-      <w:r>
-        <w:t xml:space="preserve"> this and rebuilding a merged dataset for the entire NEC.  I believe some GHGRP data may be able to replace some of the EIA/PHMSA data (need to investigate) and emailed GHGRP on 6/3/2024 to find out if we can access the GHGRP shapefiles directly.</w:t>
-      </w:r>
-    </w:p>
-    <w:p>
-      <w:pPr>
-        <w:pStyle w:val="ListParagraph"/>
-        <w:numPr>
-          <w:ilvl w:val="0"/>
-          <w:numId w:val="1"/>
-        </w:numPr>
-      </w:pPr>
-      <w:r>
-        <w:t xml:space="preserve">for NG distribution - the more detailed GHGRP data I have easy access to via </w:t>
-      </w:r>
-      <w:proofErr w:type="spellStart"/>
-      <w:r>
-        <w:t>Envirofacts</w:t>
-      </w:r>
-      <w:proofErr w:type="spellEnd"/>
-      <w:r>
-        <w:t xml:space="preserve"> now has gas volumes delivered by sector which we were getting from EIA.  We still need customer counts from EIA, but this does provide a means to automatically match those datasets.  Unfortunately, they did not perfectly match, so there </w:t>
-      </w:r>
-      <w:proofErr w:type="gramStart"/>
-      <w:r>
-        <w:t>is some question</w:t>
-      </w:r>
-      <w:proofErr w:type="gramEnd"/>
-      <w:r>
-        <w:t xml:space="preserve"> as to which we rely on.  Most do match exactly or quite close though.</w:t>
-      </w:r>
-    </w:p>
-    <w:p>
-      <w:pPr>
-        <w:pStyle w:val="ListParagraph"/>
-        <w:numPr>
-          <w:ilvl w:val="0"/>
-          <w:numId w:val="1"/>
-        </w:numPr>
-      </w:pPr>
-      <w:r>
-        <w:t xml:space="preserve">for NG distribution - there WAS an API-downloadable table that included a bunch of data I previously </w:t>
-      </w:r>
-      <w:proofErr w:type="spellStart"/>
-      <w:r>
-        <w:t>webscraped</w:t>
-      </w:r>
-      <w:proofErr w:type="spellEnd"/>
-      <w:r>
-        <w:t xml:space="preserve"> (some of which is also available in PHMSA).  However, it only goes to 2015 and I can't find equivalent data in the post 2015 data tables.  As such I'm still </w:t>
-      </w:r>
-      <w:proofErr w:type="spellStart"/>
-      <w:r>
-        <w:t>webscraping</w:t>
-      </w:r>
-      <w:proofErr w:type="spellEnd"/>
-      <w:r>
-        <w:t xml:space="preserve"> for it... https://enviro.epa.gov/envirofacts/metadata/table/ghg/w_local_dist_companies_details</w:t>
-      </w:r>
-    </w:p>
-    <w:p>
-      <w:pPr>
-        <w:pStyle w:val="ListParagraph"/>
-        <w:numPr>
-          <w:ilvl w:val="0"/>
-          <w:numId w:val="1"/>
-        </w:numPr>
-      </w:pPr>
-      <w:r>
-        <w:t xml:space="preserve">for NG distribution - the extract function takes a LONG time to run.  Doing it for each state individually is not too </w:t>
-      </w:r>
-      <w:proofErr w:type="gramStart"/>
-      <w:r>
-        <w:t>bad, but</w:t>
-      </w:r>
-      <w:proofErr w:type="gramEnd"/>
-      <w:r>
-        <w:t xml:space="preserve"> doing it for the domain as a whole is CONSIDERABLY slower.  I should investigate simply summing the state values pixel-by-pixel (should give identical output).  </w:t>
-      </w:r>
-      <w:proofErr w:type="gramStart"/>
-      <w:r>
-        <w:t>aggregate(</w:t>
-      </w:r>
-      <w:proofErr w:type="spellStart"/>
-      <w:proofErr w:type="gramEnd"/>
-      <w:r>
-        <w:t>do.call</w:t>
-      </w:r>
-      <w:proofErr w:type="spellEnd"/>
-      <w:r>
-        <w:t>(</w:t>
-      </w:r>
-      <w:proofErr w:type="spellStart"/>
-      <w:r>
-        <w:t>rbind.data.frame</w:t>
-      </w:r>
-      <w:proofErr w:type="spellEnd"/>
-      <w:r>
-        <w:t xml:space="preserve">, </w:t>
-      </w:r>
-      <w:proofErr w:type="spellStart"/>
-      <w:r>
-        <w:t>cover_all_old</w:t>
-      </w:r>
-      <w:proofErr w:type="spellEnd"/>
-      <w:r>
-        <w:t>), by=list(</w:t>
-      </w:r>
-      <w:proofErr w:type="spellStart"/>
-      <w:r>
-        <w:t>do.call</w:t>
-      </w:r>
-      <w:proofErr w:type="spellEnd"/>
-      <w:r>
-        <w:t>(</w:t>
-      </w:r>
-      <w:proofErr w:type="spellStart"/>
-      <w:r>
-        <w:t>rbind.data.frame</w:t>
-      </w:r>
-      <w:proofErr w:type="spellEnd"/>
-      <w:r>
-        <w:t xml:space="preserve">, </w:t>
-      </w:r>
-      <w:proofErr w:type="spellStart"/>
-      <w:r>
-        <w:t>cover_all_old</w:t>
-      </w:r>
-      <w:proofErr w:type="spellEnd"/>
-      <w:r>
-        <w:t>)$cell), sum,na.rm=T)</w:t>
+        <w:t>for NG distribution - we discussed having a separate script to build the by-LDC shapefiles and just including those in the package?.  Right now it's just loading in the prepared files from what I did for Philly before.  I will need to spend some time recoding this and rebuilding a merged dataset for the entire NEC.  I believe some GHGRP data may be able to replace some of the EIA/PHMSA data (need to investigate) and emailed GHGRP on 6/3/2024 to find out if we can access the GHGRP shapefiles directly.</w:t>
+      </w:r>
+    </w:p>
+    <w:p>
+      <w:pPr>
+        <w:pStyle w:val="ListParagraph"/>
+        <w:numPr>
+          <w:ilvl w:val="0"/>
+          <w:numId w:val="1"/>
+        </w:numPr>
+      </w:pPr>
+      <w:r>
+        <w:t>for NG distribution - the more detailed GHGRP data I have easy access to via Envirofacts now has gas volumes delivered by sector which we were getting from EIA.  We still need customer counts from EIA, but this does provide a means to automatically match those datasets.  Unfortunately, they did not perfectly match, so there is some question as to which we rely on.  Most do match exactly or quite close though.</w:t>
+      </w:r>
+    </w:p>
+    <w:p>
+      <w:pPr>
+        <w:pStyle w:val="ListParagraph"/>
+        <w:numPr>
+          <w:ilvl w:val="0"/>
+          <w:numId w:val="1"/>
+        </w:numPr>
+      </w:pPr>
+      <w:r>
+        <w:t>for NG distribution - there WAS an API-downloadable table that included a bunch of data I previously webscraped (some of which is also available in PHMSA).  However, it only goes to 2015 and I can't find equivalent data in the post 2015 data tables.  As such I'm still webscraping for it... https://enviro.epa.gov/envirofacts/metadata/table/ghg/w_local_dist_companies_details</w:t>
+      </w:r>
+    </w:p>
+    <w:p>
+      <w:pPr>
+        <w:pStyle w:val="ListParagraph"/>
+        <w:numPr>
+          <w:ilvl w:val="0"/>
+          <w:numId w:val="1"/>
+        </w:numPr>
+      </w:pPr>
+      <w:r>
+        <w:t>for NG distribution - the extract function takes a LONG time to run.  Doing it for each state individually is not too bad, but doing it for the domain as a whole is CONSIDERABLY slower.  I should investigate simply summing the state values pixel-by-pixel (should give identical output).  aggregate(do.call(rbind.data.frame, cover_all_old), by=list(do.call(rbind.data.frame, cover_all_old)$cell), sum,na.rm=T)</w:t>
       </w:r>
     </w:p>
     <w:p>
@@ -1317,63 +1085,31 @@
         </w:numPr>
       </w:pPr>
       <w:r>
-        <w:t xml:space="preserve">for NG </w:t>
-      </w:r>
-      <w:proofErr w:type="spellStart"/>
-      <w:r>
-        <w:t>dist</w:t>
-      </w:r>
-      <w:proofErr w:type="spellEnd"/>
-      <w:r>
-        <w:t xml:space="preserve"> and </w:t>
-      </w:r>
-      <w:proofErr w:type="spellStart"/>
-      <w:r>
-        <w:t>stat_comb</w:t>
-      </w:r>
-      <w:proofErr w:type="spellEnd"/>
-      <w:r>
-        <w:t xml:space="preserve"> - towards the end when saving and plotting there's quite a bit of redundant code that's also harder to read than it needs to be. Should clean up.</w:t>
-      </w:r>
-    </w:p>
-    <w:p>
-      <w:pPr>
-        <w:pStyle w:val="ListParagraph"/>
-        <w:numPr>
-          <w:ilvl w:val="0"/>
-          <w:numId w:val="1"/>
-        </w:numPr>
-      </w:pPr>
-      <w:r>
-        <w:t xml:space="preserve">Better </w:t>
-      </w:r>
-      <w:proofErr w:type="gramStart"/>
-      <w:r>
-        <w:t>organize</w:t>
-      </w:r>
-      <w:proofErr w:type="gramEnd"/>
-      <w:r>
-        <w:t xml:space="preserve"> output.  I think xl files in 1 folder, subsector output in 1, and sector output in a third</w:t>
-      </w:r>
-    </w:p>
-    <w:p>
-      <w:pPr>
-        <w:pStyle w:val="ListParagraph"/>
-        <w:numPr>
-          <w:ilvl w:val="0"/>
-          <w:numId w:val="1"/>
-        </w:numPr>
-      </w:pPr>
-      <w:r>
-        <w:t xml:space="preserve">Make all inputs to the </w:t>
-      </w:r>
-      <w:proofErr w:type="gramStart"/>
-      <w:r>
-        <w:t>functions</w:t>
-      </w:r>
-      <w:proofErr w:type="gramEnd"/>
-      <w:r>
-        <w:t xml:space="preserve"> actual arguments, not pulled from global.</w:t>
+        <w:t>for NG dist and stat_comb - towards the end when saving and plotting there's quite a bit of redundant code that's also harder to read than it needs to be. Should clean up.</w:t>
+      </w:r>
+    </w:p>
+    <w:p>
+      <w:pPr>
+        <w:pStyle w:val="ListParagraph"/>
+        <w:numPr>
+          <w:ilvl w:val="0"/>
+          <w:numId w:val="1"/>
+        </w:numPr>
+      </w:pPr>
+      <w:r>
+        <w:t>Better organize output.  I think xl files in 1 folder, subsector output in 1, and sector output in a third</w:t>
+      </w:r>
+    </w:p>
+    <w:p>
+      <w:pPr>
+        <w:pStyle w:val="ListParagraph"/>
+        <w:numPr>
+          <w:ilvl w:val="0"/>
+          <w:numId w:val="1"/>
+        </w:numPr>
+      </w:pPr>
+      <w:r>
+        <w:t>Make all inputs to the functions actual arguments, not pulled from global.</w:t>
       </w:r>
     </w:p>
     <w:p>
@@ -1397,70 +1133,19 @@
         </w:numPr>
       </w:pPr>
       <w:r>
-        <w:t xml:space="preserve">add proper error handling for each script that includes more informative user updates - </w:t>
-      </w:r>
-      <w:proofErr w:type="spellStart"/>
-      <w:r>
-        <w:t>trycatch</w:t>
-      </w:r>
-      <w:proofErr w:type="spellEnd"/>
-      <w:r>
-        <w:t>?  Have some failsafe to avoid combining if any failed?</w:t>
-      </w:r>
-    </w:p>
-    <w:p>
-      <w:pPr>
-        <w:pStyle w:val="ListParagraph"/>
-        <w:numPr>
-          <w:ilvl w:val="0"/>
-          <w:numId w:val="1"/>
-        </w:numPr>
-      </w:pPr>
-      <w:r>
-        <w:t xml:space="preserve">stationary combustion and NG </w:t>
-      </w:r>
-      <w:proofErr w:type="spellStart"/>
-      <w:r>
-        <w:t>dist</w:t>
-      </w:r>
-      <w:proofErr w:type="spellEnd"/>
-      <w:r>
-        <w:t xml:space="preserve"> - get ACES/Vulcan files more flexibly, </w:t>
-      </w:r>
-      <w:proofErr w:type="spellStart"/>
-      <w:proofErr w:type="gramStart"/>
-      <w:r>
-        <w:t>list.files</w:t>
-      </w:r>
-      <w:proofErr w:type="spellEnd"/>
-      <w:proofErr w:type="gramEnd"/>
-      <w:r>
-        <w:t xml:space="preserve">(recursive=T) and instead of </w:t>
-      </w:r>
-      <w:proofErr w:type="spellStart"/>
-      <w:r>
-        <w:t>subsetting</w:t>
-      </w:r>
-      <w:proofErr w:type="spellEnd"/>
-      <w:r>
-        <w:t xml:space="preserve"> to inventory year, default to it, but work through a list going out from there (or something like this).  Non-issue for Vulcan, all years </w:t>
-      </w:r>
-      <w:proofErr w:type="gramStart"/>
-      <w:r>
-        <w:lastRenderedPageBreak/>
-        <w:t>are</w:t>
-      </w:r>
-      <w:proofErr w:type="gramEnd"/>
-      <w:r>
-        <w:t xml:space="preserve"> in the same file.  Need to think about a good way to avoid weirdly having inventory year and </w:t>
-      </w:r>
-      <w:proofErr w:type="spellStart"/>
-      <w:r>
-        <w:t>aces_year</w:t>
-      </w:r>
-      <w:proofErr w:type="spellEnd"/>
-      <w:r>
-        <w:t xml:space="preserve"> as inputs.</w:t>
+        <w:t>add proper error handling for each script that includes more informative user updates - trycatch?  Have some failsafe to avoid combining if any failed?</w:t>
+      </w:r>
+    </w:p>
+    <w:p>
+      <w:pPr>
+        <w:pStyle w:val="ListParagraph"/>
+        <w:numPr>
+          <w:ilvl w:val="0"/>
+          <w:numId w:val="1"/>
+        </w:numPr>
+      </w:pPr>
+      <w:r>
+        <w:t>stationary combustion and NG dist - get ACES/Vulcan files more flexibly, list.files(recursive=T) and instead of subsetting to inventory year, default to it, but work through a list going out from there (or something like this).  Non-issue for Vulcan, all years are in the same file.  Need to think about a good way to avoid weirdly having inventory year and aces_year as inputs.</w:t>
       </w:r>
     </w:p>
     <w:p>
@@ -1474,7 +1159,7 @@
       <w:r>
         <w:t xml:space="preserve">WWTP – check </w:t>
       </w:r>
-      <w:hyperlink r:id="rId6" w:history="1">
+      <w:hyperlink r:id="rId8" w:history="1">
         <w:r>
           <w:rPr>
             <w:rStyle w:val="Hyperlink"/>
@@ -1485,7 +1170,7 @@
       <w:r>
         <w:t xml:space="preserve"> and </w:t>
       </w:r>
-      <w:hyperlink r:id="rId7" w:history="1">
+      <w:hyperlink r:id="rId9" w:anchor="/" w:history="1">
         <w:r>
           <w:rPr>
             <w:rStyle w:val="Hyperlink"/>
@@ -1518,9 +1203,10 @@
         </w:numPr>
       </w:pPr>
       <w:r>
+        <w:lastRenderedPageBreak/>
         <w:t xml:space="preserve">Wastewater - </w:t>
       </w:r>
-      <w:hyperlink r:id="rId8" w:history="1">
+      <w:hyperlink r:id="rId10" w:history="1">
         <w:r>
           <w:rPr>
             <w:rStyle w:val="Hyperlink"/>
@@ -1541,7 +1227,7 @@
           <w:szCs w:val="36"/>
         </w:rPr>
       </w:pPr>
-      <w:bookmarkStart w:id="0" w:name="_Hlk169535452"/>
+      <w:bookmarkStart w:id="2" w:name="_Hlk169535452"/>
       <w:r>
         <w:rPr>
           <w:b/>
@@ -1552,7 +1238,7 @@
         <w:t>Checks vs old code</w:t>
       </w:r>
     </w:p>
-    <w:bookmarkEnd w:id="0"/>
+    <w:bookmarkEnd w:id="2"/>
     <w:p>
       <w:pPr>
         <w:pStyle w:val="ListParagraph"/>
@@ -1742,6 +1428,14 @@
     <w:abstractNumId w:val="0"/>
   </w:num>
 </w:numbering>
+</file>
+
+<file path=word/people.xml><?xml version="1.0" encoding="utf-8"?>
+<w15:people xmlns:wpc="http://schemas.microsoft.com/office/word/2010/wordprocessingCanvas" xmlns:cx="http://schemas.microsoft.com/office/drawing/2014/chartex" xmlns:cx1="http://schemas.microsoft.com/office/drawing/2015/9/8/chartex" xmlns:cx2="http://schemas.microsoft.com/office/drawing/2015/10/21/chartex" xmlns:cx3="http://schemas.microsoft.com/office/drawing/2016/5/9/chartex" xmlns:cx4="http://schemas.microsoft.com/office/drawing/2016/5/10/chartex" xmlns:cx5="http://schemas.microsoft.com/office/drawing/2016/5/11/chartex" xmlns:cx6="http://schemas.microsoft.com/office/drawing/2016/5/12/chartex" xmlns:cx7="http://schemas.microsoft.com/office/drawing/2016/5/13/chartex" xmlns:cx8="http://schemas.microsoft.com/office/drawing/2016/5/14/chartex" xmlns:mc="http://schemas.openxmlformats.org/markup-compatibility/2006" xmlns:aink="http://schemas.microsoft.com/office/drawing/2016/ink" xmlns:am3d="http://schemas.microsoft.com/office/drawing/2017/model3d" xmlns:o="urn:schemas-microsoft-com:office:office" xmlns:oel="http://schemas.microsoft.com/office/2019/extlst" xmlns:r="http://schemas.openxmlformats.org/officeDocument/2006/relationships" xmlns:m="http://schemas.openxmlformats.org/officeDocument/2006/math" xmlns:v="urn:schemas-microsoft-com:vml" xmlns:wp14="http://schemas.microsoft.com/office/word/2010/wordprocessingDrawing" xmlns:wp="http://schemas.openxmlformats.org/drawingml/2006/wordprocessingDrawing" xmlns:w10="urn:schemas-microsoft-com:office:word" xmlns:w="http://schemas.openxmlformats.org/wordprocessingml/2006/main" xmlns:w14="http://schemas.microsoft.com/office/word/2010/wordml" xmlns:w15="http://schemas.microsoft.com/office/word/2012/wordml" xmlns:w16cex="http://schemas.microsoft.com/office/word/2018/wordml/cex" xmlns:w16cid="http://schemas.microsoft.com/office/word/2016/wordml/cid" xmlns:w16="http://schemas.microsoft.com/office/word/2018/wordml" xmlns:w16du="http://schemas.microsoft.com/office/word/2023/wordml/word16du" xmlns:w16sdtdh="http://schemas.microsoft.com/office/word/2020/wordml/sdtdatahash" xmlns:w16se="http://schemas.microsoft.com/office/word/2015/wordml/symex" xmlns:wpg="http://schemas.microsoft.com/office/word/2010/wordprocessingGroup" xmlns:wpi="http://schemas.microsoft.com/office/word/2010/wordprocessingInk" xmlns:wne="http://schemas.microsoft.com/office/word/2006/wordml" xmlns:wps="http://schemas.microsoft.com/office/word/2010/wordprocessingShape" mc:Ignorable="w14 w15 w16se w16cid w16 w16cex w16sdtdh w16du wp14">
+  <w15:person w15:author="Kristian Hajny">
+    <w15:presenceInfo w15:providerId="AD" w15:userId="S::Kristian.Hajny@stonybrook.edu::4f870885-1073-4ea0-924d-38e9fb4e406d"/>
+  </w15:person>
+</w15:people>
 </file>
 
 <file path=word/styles.xml><?xml version="1.0" encoding="utf-8"?>

</xml_diff>